<commit_message>
Show both office addresses in the letterhead header and footer
The header lists the Midrand and Pretoria offices side by side under gold
labels, and the footer repeats both on a line each above the company line.
Applies to the printed letterhead, every Word template and Normal.dotm,
which share the same header and footer. Margins grow slightly to fit.

Co-Authored-By: Claude Opus 5.5 <noreply@anthropic.com>
Claude-Session: https://claude.ai/code/session_017srChrgN1Nb9D2fpe1WXj6
</commit_message>
<xml_diff>
--- a/brand/06 - STATIONERY/Letterhead/Mmako Inc - Document Template.docx
+++ b/brand/06 - STATIONERY/Letterhead/Mmako Inc - Document Template.docx
@@ -129,7 +129,7 @@
       <w:headerReference w:type="default" r:id="rId6"/>
       <w:footerReference w:type="default" r:id="rId7"/>
       <w:pgSz w:w="11906" w:h="16838" w:orient="portrait"/>
-      <w:pgMar w:top="1985" w:right="1134" w:bottom="1418" w:left="1134" w:header="680" w:footer="567" w:gutter="0"/>
+      <w:pgMar w:top="2381" w:right="1134" w:bottom="1758" w:left="1134" w:header="624" w:footer="510" w:gutter="0"/>
       <w:pgNumType/>
       <w:docGrid w:linePitch="360"/>
     </w:sectPr>
@@ -195,10 +195,60 @@
   </w:p>
   <w:p>
     <w:pPr>
+      <w:spacing w:after="20"/>
+    </w:pPr>
+    <w:r>
+      <w:rPr>
+        <w:rFonts w:ascii="Montserrat" w:cs="Montserrat" w:eastAsia="Montserrat" w:hAnsi="Montserrat"/>
+        <w:b/>
+        <w:bCs/>
+        <w:color w:val="85693B"/>
+        <w:sz w:val="13"/>
+        <w:szCs w:val="13"/>
+      </w:rPr>
+      <w:t xml:space="preserve">Midrand office  </w:t>
+    </w:r>
+    <w:r>
+      <w:rPr>
+        <w:rFonts w:ascii="Montserrat" w:cs="Montserrat" w:eastAsia="Montserrat" w:hAnsi="Montserrat"/>
+        <w:color w:val="6B6A66"/>
+        <w:sz w:val="13"/>
+        <w:szCs w:val="13"/>
+      </w:rPr>
+      <w:t xml:space="preserve">Regus Waterfall City, Maxwell Office Park, Ground Floor, Mac Mac Building, Magwa Cres, Waterfall City, Midrand, 2090</w:t>
+    </w:r>
+  </w:p>
+  <w:p>
+    <w:pPr>
+      <w:spacing w:after="20"/>
+    </w:pPr>
+    <w:r>
+      <w:rPr>
+        <w:rFonts w:ascii="Montserrat" w:cs="Montserrat" w:eastAsia="Montserrat" w:hAnsi="Montserrat"/>
+        <w:b/>
+        <w:bCs/>
+        <w:color w:val="85693B"/>
+        <w:sz w:val="13"/>
+        <w:szCs w:val="13"/>
+      </w:rPr>
+      <w:t xml:space="preserve">Pretoria office  </w:t>
+    </w:r>
+    <w:r>
+      <w:rPr>
+        <w:rFonts w:ascii="Montserrat" w:cs="Montserrat" w:eastAsia="Montserrat" w:hAnsi="Montserrat"/>
+        <w:color w:val="6B6A66"/>
+        <w:sz w:val="13"/>
+        <w:szCs w:val="13"/>
+      </w:rPr>
+      <w:t xml:space="preserve">4A Pioneer Road, Irene Security Estate, Centurion, 0157</w:t>
+    </w:r>
+  </w:p>
+  <w:p>
+    <w:pPr>
       <w:tabs>
         <w:tab w:val="right" w:pos="9026"/>
       </w:tabs>
-      <w:spacing w:after="0"/>
+      <w:spacing w:after="0" w:before="40"/>
     </w:pPr>
     <w:r>
       <w:rPr>
@@ -328,13 +378,14 @@
       </w:tblBorders>
     </w:tblPr>
     <w:tblGrid>
-      <w:gridCol w:w="3200"/>
-      <w:gridCol w:w="6000"/>
+      <w:gridCol w:w="2600"/>
+      <w:gridCol w:w="3600"/>
+      <w:gridCol w:w="3000"/>
     </w:tblGrid>
     <w:tr>
       <w:tc>
         <w:tcPr>
-          <w:tcW w:type="dxa" w:w="3200"/>
+          <w:tcW w:type="dxa" w:w="2600"/>
           <w:tcBorders>
             <w:top w:val="none" w:color="auto" w:sz="0"/>
             <w:left w:val="none" w:color="auto" w:sz="0"/>
@@ -390,7 +441,7 @@
       </w:tc>
       <w:tc>
         <w:tcPr>
-          <w:tcW w:type="dxa" w:w="6000"/>
+          <w:tcW w:type="dxa" w:w="3600"/>
           <w:tcBorders>
             <w:top w:val="none" w:color="auto" w:sz="0"/>
             <w:left w:val="none" w:color="auto" w:sz="0"/>
@@ -398,6 +449,25 @@
             <w:right w:val="none" w:color="auto" w:sz="0"/>
           </w:tcBorders>
         </w:tcPr>
+        <w:p>
+          <w:pPr>
+            <w:spacing w:after="20" w:before="0"/>
+            <w:jc w:val="right"/>
+          </w:pPr>
+          <w:r>
+            <w:rPr>
+              <w:rFonts w:ascii="Montserrat" w:cs="Montserrat" w:eastAsia="Montserrat" w:hAnsi="Montserrat"/>
+              <w:b/>
+              <w:bCs/>
+              <w:caps/>
+              <w:color w:val="85693B"/>
+              <w:spacing w:val="20"/>
+              <w:sz w:val="13"/>
+              <w:szCs w:val="13"/>
+            </w:rPr>
+            <w:t xml:space="preserve">Midrand office</w:t>
+          </w:r>
+        </w:p>
         <w:p>
           <w:pPr>
             <w:spacing w:after="0" w:before="0"/>
@@ -458,6 +528,81 @@
             <w:t xml:space="preserve">Midrand, 2090</w:t>
           </w:r>
         </w:p>
+      </w:tc>
+      <w:tc>
+        <w:tcPr>
+          <w:tcW w:type="dxa" w:w="3000"/>
+          <w:tcBorders>
+            <w:top w:val="none" w:color="auto" w:sz="0"/>
+            <w:left w:val="none" w:color="auto" w:sz="0"/>
+            <w:bottom w:val="none" w:color="auto" w:sz="0"/>
+            <w:right w:val="none" w:color="auto" w:sz="0"/>
+          </w:tcBorders>
+        </w:tcPr>
+        <w:p>
+          <w:pPr>
+            <w:spacing w:after="20" w:before="0"/>
+            <w:jc w:val="right"/>
+          </w:pPr>
+          <w:r>
+            <w:rPr>
+              <w:rFonts w:ascii="Montserrat" w:cs="Montserrat" w:eastAsia="Montserrat" w:hAnsi="Montserrat"/>
+              <w:b/>
+              <w:bCs/>
+              <w:caps/>
+              <w:color w:val="85693B"/>
+              <w:spacing w:val="20"/>
+              <w:sz w:val="13"/>
+              <w:szCs w:val="13"/>
+            </w:rPr>
+            <w:t xml:space="preserve">Pretoria office</w:t>
+          </w:r>
+        </w:p>
+        <w:p>
+          <w:pPr>
+            <w:spacing w:after="0" w:before="0"/>
+            <w:jc w:val="right"/>
+          </w:pPr>
+          <w:r>
+            <w:rPr>
+              <w:rFonts w:ascii="Montserrat" w:cs="Montserrat" w:eastAsia="Montserrat" w:hAnsi="Montserrat"/>
+              <w:color w:val="6B6A66"/>
+              <w:sz w:val="15"/>
+              <w:szCs w:val="15"/>
+            </w:rPr>
+            <w:t xml:space="preserve">4A Pioneer Road</w:t>
+          </w:r>
+        </w:p>
+        <w:p>
+          <w:pPr>
+            <w:spacing w:after="0" w:before="0"/>
+            <w:jc w:val="right"/>
+          </w:pPr>
+          <w:r>
+            <w:rPr>
+              <w:rFonts w:ascii="Montserrat" w:cs="Montserrat" w:eastAsia="Montserrat" w:hAnsi="Montserrat"/>
+              <w:color w:val="6B6A66"/>
+              <w:sz w:val="15"/>
+              <w:szCs w:val="15"/>
+            </w:rPr>
+            <w:t xml:space="preserve">Irene Security Estate</w:t>
+          </w:r>
+        </w:p>
+        <w:p>
+          <w:pPr>
+            <w:spacing w:after="0" w:before="0"/>
+            <w:jc w:val="right"/>
+          </w:pPr>
+          <w:r>
+            <w:rPr>
+              <w:rFonts w:ascii="Montserrat" w:cs="Montserrat" w:eastAsia="Montserrat" w:hAnsi="Montserrat"/>
+              <w:color w:val="6B6A66"/>
+              <w:sz w:val="15"/>
+              <w:szCs w:val="15"/>
+            </w:rPr>
+            <w:t xml:space="preserve">Centurion, 0157</w:t>
+          </w:r>
+        </w:p>
         <w:p>
           <w:pPr>
             <w:spacing w:after="0" w:before="0"/>
@@ -614,6 +759,21 @@
   <w:style w:type="paragraph" w:styleId="Normal" w:default="1">
     <w:name w:val="Normal"/>
     <w:qFormat/>
+  </w:style>
+  <w:style w:type="table" w:styleId="TableNormal" w:default="true">
+    <w:name w:val="Normal Table"/>
+    <w:uiPriority w:val="99"/>
+    <w:semiHidden/>
+    <w:unhideWhenUsed/>
+    <w:tblPr>
+      <w:tblInd w:type="dxa" w:w="0"/>
+      <w:tblCellMar>
+        <w:top w:type="dxa" w:w="0"/>
+        <w:left w:type="dxa" w:w="108"/>
+        <w:bottom w:type="dxa" w:w="0"/>
+        <w:right w:type="dxa" w:w="108"/>
+      </w:tblCellMar>
+    </w:tblPr>
   </w:style>
   <w:style w:type="paragraph" w:styleId="Heading4">
     <w:name w:val="Heading 4"/>

</xml_diff>